<commit_message>
Meer event-instrumentatie + dashboard in de docs
- Extra events: cta_send / cta_login (header + mobiel), lang_switch
  (taalwissel), app_install_click / app_installed (PWA-installatie).
- Testgids: "Gebruik & activiteit"-dashboard toegevoegd aan de admin-sectie.
- Voortgangsoverzicht 31 aug (artifact + Word) uitgebreid met "Beheer &
  inzicht" (activiteit-dashboard + event-laag).

Typecheck schoon.

Co-Authored-By: Claude Opus 4.8 <noreply@anthropic.com>
</commit_message>
<xml_diff>
--- a/docs/BugaWuga-voortgang-31-augustus.docx
+++ b/docs/BugaWuga-voortgang-31-augustus.docx
@@ -927,6 +927,180 @@
           <w:szCs w:val="21"/>
         </w:rPr>
         <w:t xml:space="preserve">  —  alles wat een tester nodig heeft in één bericht: URL, toegang, demo-accounts en de golden-path.</w:t>
+      </w:r>
+    </w:p>
+    <w:p>
+      <w:pPr>
+        <w:spacing w:after="40" w:before="300"/>
+      </w:pPr>
+      <w:r>
+        <w:rPr>
+          <w:rFonts w:ascii="Calibri" w:cs="Calibri" w:eastAsia="Calibri" w:hAnsi="Calibri"/>
+          <w:b/>
+          <w:bCs/>
+          <w:color w:val="4F7A1B"/>
+          <w:spacing w:val="40"/>
+          <w:sz w:val="16"/>
+          <w:szCs w:val="16"/>
+        </w:rPr>
+        <w:t xml:space="preserve">BEHEER &amp; INZICHT</w:t>
+      </w:r>
+    </w:p>
+    <w:p>
+      <w:pPr>
+        <w:pStyle w:val="Heading2"/>
+        <w:spacing w:after="60" w:before="20"/>
+      </w:pPr>
+      <w:r>
+        <w:rPr>
+          <w:rFonts w:ascii="Georgia" w:cs="Georgia" w:eastAsia="Georgia" w:hAnsi="Georgia"/>
+          <w:b/>
+          <w:bCs/>
+          <w:color w:val="23201A"/>
+          <w:sz w:val="30"/>
+          <w:szCs w:val="30"/>
+        </w:rPr>
+        <w:t xml:space="preserve">Zien wie er actief is</w:t>
+      </w:r>
+    </w:p>
+    <w:p>
+      <w:pPr>
+        <w:spacing w:after="140"/>
+      </w:pPr>
+      <w:r>
+        <w:rPr>
+          <w:rFonts w:ascii="Calibri" w:cs="Calibri" w:eastAsia="Calibri" w:hAnsi="Calibri"/>
+          <w:color w:val="6F695B"/>
+          <w:sz w:val="21"/>
+          <w:szCs w:val="21"/>
+        </w:rPr>
+        <w:t xml:space="preserve">Tijdens de test kwam de vraag op: hoeveel mensen zijn er effectief bezig? Nu meetbaar — voor de test én breder beheer, privacy-vriendelijk en zonder externe tool.</w:t>
+      </w:r>
+    </w:p>
+    <w:p>
+      <w:pPr>
+        <w:spacing w:after="20" w:before="120"/>
+      </w:pPr>
+      <w:r>
+        <w:rPr>
+          <w:rFonts w:ascii="Calibri" w:cs="Calibri" w:eastAsia="Calibri" w:hAnsi="Calibri"/>
+          <w:b/>
+          <w:bCs/>
+          <w:color w:val="23201A"/>
+          <w:sz w:val="21"/>
+          <w:szCs w:val="21"/>
+        </w:rPr>
+        <w:t xml:space="preserve">Activiteit-dashboard</w:t>
+      </w:r>
+      <w:r>
+        <w:rPr>
+          <w:rFonts w:ascii="Calibri" w:cs="Calibri" w:eastAsia="Calibri" w:hAnsi="Calibri"/>
+          <w:color w:val="6F695B"/>
+          <w:sz w:val="21"/>
+          <w:szCs w:val="21"/>
+        </w:rPr>
+        <w:t xml:space="preserve">  —  uit bestaande data (sessies + audit-log) — geen aparte tracking, dus met terugwerkende kracht.</w:t>
+      </w:r>
+    </w:p>
+    <w:p>
+      <w:pPr>
+        <w:pStyle w:val="ListParagraph"/>
+        <w:numPr>
+          <w:ilvl w:val="0"/>
+          <w:numId w:val="2"/>
+        </w:numPr>
+        <w:spacing w:after="20"/>
+      </w:pPr>
+      <w:r>
+        <w:rPr>
+          <w:rFonts w:ascii="Calibri" w:cs="Calibri" w:eastAsia="Calibri" w:hAnsi="Calibri"/>
+          <w:color w:val="23201A"/>
+          <w:sz w:val="20"/>
+          <w:szCs w:val="20"/>
+        </w:rPr>
+        <w:t xml:space="preserve">Actieve gebruikers 24u/7d/30d + wie er actief is geweest (laatste login + logins/acties per lid).</w:t>
+      </w:r>
+    </w:p>
+    <w:p>
+      <w:pPr>
+        <w:pStyle w:val="ListParagraph"/>
+        <w:numPr>
+          <w:ilvl w:val="0"/>
+          <w:numId w:val="2"/>
+        </w:numPr>
+        <w:spacing w:after="20"/>
+      </w:pPr>
+      <w:r>
+        <w:rPr>
+          <w:rFonts w:ascii="Calibri" w:cs="Calibri" w:eastAsia="Calibri" w:hAnsi="Calibri"/>
+          <w:color w:val="23201A"/>
+          <w:sz w:val="20"/>
+          <w:szCs w:val="20"/>
+        </w:rPr>
+        <w:t xml:space="preserve">Activiteitstrechter van registratie tot levering.</w:t>
+      </w:r>
+    </w:p>
+    <w:p>
+      <w:pPr>
+        <w:spacing w:after="20" w:before="120"/>
+      </w:pPr>
+      <w:r>
+        <w:rPr>
+          <w:rFonts w:ascii="Calibri" w:cs="Calibri" w:eastAsia="Calibri" w:hAnsi="Calibri"/>
+          <w:b/>
+          <w:bCs/>
+          <w:color w:val="23201A"/>
+          <w:sz w:val="21"/>
+          <w:szCs w:val="21"/>
+        </w:rPr>
+        <w:t xml:space="preserve">Event-laag</w:t>
+      </w:r>
+      <w:r>
+        <w:rPr>
+          <w:rFonts w:ascii="Calibri" w:cs="Calibri" w:eastAsia="Calibri" w:hAnsi="Calibri"/>
+          <w:color w:val="6F695B"/>
+          <w:sz w:val="21"/>
+          <w:szCs w:val="21"/>
+        </w:rPr>
+        <w:t xml:space="preserve">  —  ook niet-transactionele acties, vanaf nu.</w:t>
+      </w:r>
+    </w:p>
+    <w:p>
+      <w:pPr>
+        <w:pStyle w:val="ListParagraph"/>
+        <w:numPr>
+          <w:ilvl w:val="0"/>
+          <w:numId w:val="2"/>
+        </w:numPr>
+        <w:spacing w:after="20"/>
+      </w:pPr>
+      <w:r>
+        <w:rPr>
+          <w:rFonts w:ascii="Calibri" w:cs="Calibri" w:eastAsia="Calibri" w:hAnsi="Calibri"/>
+          <w:color w:val="23201A"/>
+          <w:sz w:val="20"/>
+          <w:szCs w:val="20"/>
+        </w:rPr>
+        <w:t xml:space="preserve">Paginaweergaven, “check gebruikt” en widget-kliks.</w:t>
+      </w:r>
+    </w:p>
+    <w:p>
+      <w:pPr>
+        <w:pStyle w:val="ListParagraph"/>
+        <w:numPr>
+          <w:ilvl w:val="0"/>
+          <w:numId w:val="2"/>
+        </w:numPr>
+        <w:spacing w:after="20"/>
+      </w:pPr>
+      <w:r>
+        <w:rPr>
+          <w:rFonts w:ascii="Calibri" w:cs="Calibri" w:eastAsia="Calibri" w:hAnsi="Calibri"/>
+          <w:color w:val="23201A"/>
+          <w:sz w:val="20"/>
+          <w:szCs w:val="20"/>
+        </w:rPr>
+        <w:t xml:space="preserve">Privacy-vriendelijk &amp; self-hosted; later koppelbaar aan een tool als PostHog.</w:t>
       </w:r>
     </w:p>
     <w:p>

</xml_diff>